<commit_message>
idk, i hope i added some info on how to install usb debugging for android
</commit_message>
<xml_diff>
--- a/Basic app on android.docx
+++ b/Basic app on android.docx
@@ -104,7 +104,213 @@
       <w:pPr>
         <w:ind w:left="360"/>
       </w:pPr>
+      <w:r>
+        <w:t xml:space="preserve">To download </w:t>
+      </w:r>
+      <w:proofErr w:type="spellStart"/>
+      <w:r>
+        <w:t>usb</w:t>
+      </w:r>
+      <w:proofErr w:type="spellEnd"/>
+      <w:r>
+        <w:t xml:space="preserve"> support I tried this</w:t>
+      </w:r>
+    </w:p>
+    <w:p>
+      <w:pPr>
+        <w:ind w:left="360"/>
+      </w:pPr>
       <w:hyperlink r:id="rId7" w:history="1">
+        <w:r>
+          <w:rPr>
+            <w:rStyle w:val="Hyperlink"/>
+          </w:rPr>
+          <w:t>https://developer.android.com/studio/run/win-usb</w:t>
+        </w:r>
+      </w:hyperlink>
+    </w:p>
+    <w:p>
+      <w:pPr>
+        <w:ind w:left="360"/>
+      </w:pPr>
+      <w:r>
+        <w:t xml:space="preserve">and to install </w:t>
+      </w:r>
+      <w:proofErr w:type="spellStart"/>
+      <w:r>
+        <w:t>usb</w:t>
+      </w:r>
+      <w:proofErr w:type="spellEnd"/>
+      <w:r>
+        <w:t xml:space="preserve"> driver and allow debugging on the phone via </w:t>
+      </w:r>
+      <w:proofErr w:type="spellStart"/>
+      <w:r>
+        <w:t>usb</w:t>
+      </w:r>
+      <w:proofErr w:type="spellEnd"/>
+      <w:r>
+        <w:t>, follow steps here:</w:t>
+      </w:r>
+    </w:p>
+    <w:p>
+      <w:pPr>
+        <w:ind w:left="360"/>
+      </w:pPr>
+      <w:r>
+        <w:t xml:space="preserve">( I did not have to install </w:t>
+      </w:r>
+      <w:proofErr w:type="spellStart"/>
+      <w:r>
+        <w:t>oem</w:t>
+      </w:r>
+      <w:proofErr w:type="spellEnd"/>
+      <w:r>
+        <w:t xml:space="preserve"> drivers, Huawei was detected)</w:t>
+      </w:r>
+    </w:p>
+    <w:p>
+      <w:pPr>
+        <w:ind w:left="360"/>
+      </w:pPr>
+      <w:hyperlink r:id="rId8" w:anchor="InstallingDriver" w:history="1">
+        <w:r>
+          <w:rPr>
+            <w:rStyle w:val="Hyperlink"/>
+          </w:rPr>
+          <w:t>https://developer.android.com/studio/run/oem-usb#InstallingDriver</w:t>
+        </w:r>
+      </w:hyperlink>
+      <w:r>
+        <w:br/>
+      </w:r>
+    </w:p>
+    <w:p>
+      <w:pPr>
+        <w:ind w:left="360"/>
+      </w:pPr>
+      <w:r>
+        <w:t xml:space="preserve">your </w:t>
+      </w:r>
+      <w:proofErr w:type="spellStart"/>
+      <w:r>
+        <w:t>usb</w:t>
+      </w:r>
+      <w:proofErr w:type="spellEnd"/>
+      <w:r>
+        <w:t xml:space="preserve"> driver should be located under </w:t>
+      </w:r>
+    </w:p>
+    <w:p>
+      <w:pPr>
+        <w:ind w:left="360"/>
+      </w:pPr>
+      <w:r>
+        <w:t>step 8 might not work  because “the best is already installed” so I tried this to see if my device is detected:</w:t>
+      </w:r>
+    </w:p>
+    <w:p>
+      <w:pPr>
+        <w:ind w:left="360"/>
+      </w:pPr>
+      <w:hyperlink r:id="rId9" w:history="1">
+        <w:r>
+          <w:rPr>
+            <w:rStyle w:val="Hyperlink"/>
+          </w:rPr>
+          <w:t>https://android.stackexchange.com/questions/206108/cant-install-google-usb-driver</w:t>
+        </w:r>
+      </w:hyperlink>
+    </w:p>
+    <w:p>
+      <w:pPr>
+        <w:ind w:left="360"/>
+        <w:rPr>
+          <w:rStyle w:val="Strong"/>
+          <w:rFonts w:ascii="Arial" w:hAnsi="Arial" w:cs="Arial"/>
+          <w:color w:val="242729"/>
+          <w:sz w:val="23"/>
+          <w:szCs w:val="23"/>
+          <w:bdr w:val="none" w:sz="0" w:space="0" w:color="auto" w:frame="1"/>
+          <w:shd w:val="clear" w:color="auto" w:fill="FFFFFF"/>
+        </w:rPr>
+      </w:pPr>
+      <w:r>
+        <w:t xml:space="preserve">you don’t need to install </w:t>
+      </w:r>
+      <w:proofErr w:type="spellStart"/>
+      <w:r>
+        <w:t>adb</w:t>
+      </w:r>
+      <w:proofErr w:type="spellEnd"/>
+      <w:r>
+        <w:t xml:space="preserve">, it is already installed with the </w:t>
+      </w:r>
+      <w:proofErr w:type="spellStart"/>
+      <w:r>
+        <w:t>sdk</w:t>
+      </w:r>
+      <w:proofErr w:type="spellEnd"/>
+      <w:r>
+        <w:t>-tools you installed earlier and if you follow steps from “</w:t>
+      </w:r>
+      <w:r>
+        <w:rPr>
+          <w:rStyle w:val="Strong"/>
+          <w:rFonts w:ascii="Arial" w:hAnsi="Arial" w:cs="Arial"/>
+          <w:color w:val="242729"/>
+          <w:sz w:val="23"/>
+          <w:szCs w:val="23"/>
+          <w:bdr w:val="none" w:sz="0" w:space="0" w:color="auto" w:frame="1"/>
+          <w:shd w:val="clear" w:color="auto" w:fill="FFFFFF"/>
+        </w:rPr>
+        <w:t xml:space="preserve">SO THAT'S A.D.B INSTALLED” from the link above, you should at least see your device as “ </w:t>
+      </w:r>
+      <w:proofErr w:type="spellStart"/>
+      <w:r>
+        <w:rPr>
+          <w:rStyle w:val="Strong"/>
+          <w:rFonts w:ascii="Arial" w:hAnsi="Arial" w:cs="Arial"/>
+          <w:color w:val="242729"/>
+          <w:sz w:val="23"/>
+          <w:szCs w:val="23"/>
+          <w:bdr w:val="none" w:sz="0" w:space="0" w:color="auto" w:frame="1"/>
+          <w:shd w:val="clear" w:color="auto" w:fill="FFFFFF"/>
+        </w:rPr>
+        <w:t>unautorized</w:t>
+      </w:r>
+      <w:proofErr w:type="spellEnd"/>
+      <w:r>
+        <w:rPr>
+          <w:rStyle w:val="Strong"/>
+          <w:rFonts w:ascii="Arial" w:hAnsi="Arial" w:cs="Arial"/>
+          <w:color w:val="242729"/>
+          <w:sz w:val="23"/>
+          <w:szCs w:val="23"/>
+          <w:bdr w:val="none" w:sz="0" w:space="0" w:color="auto" w:frame="1"/>
+          <w:shd w:val="clear" w:color="auto" w:fill="FFFFFF"/>
+        </w:rPr>
+        <w:t>”</w:t>
+      </w:r>
+    </w:p>
+    <w:p>
+      <w:pPr>
+        <w:ind w:left="360"/>
+      </w:pPr>
+      <w:r>
+        <w:t>about android:</w:t>
+      </w:r>
+    </w:p>
+    <w:p>
+      <w:pPr>
+        <w:ind w:left="360"/>
+      </w:pPr>
+    </w:p>
+    <w:p>
+      <w:pPr>
+        <w:ind w:left="360"/>
+      </w:pPr>
+      <w:hyperlink r:id="rId10" w:history="1">
         <w:r>
           <w:rPr>
             <w:rStyle w:val="Hyperlink"/>
@@ -117,7 +323,7 @@
       <w:pPr>
         <w:ind w:left="360"/>
       </w:pPr>
-      <w:hyperlink r:id="rId8" w:history="1">
+      <w:hyperlink r:id="rId11" w:history="1">
         <w:r>
           <w:rPr>
             <w:rStyle w:val="Hyperlink"/>
@@ -140,7 +346,15 @@
         </w:numPr>
       </w:pPr>
       <w:r>
-        <w:t>Text box to paste the link and share it on the main page (Youtube + Spotify</w:t>
+        <w:t>Text box to paste the link and share it on the main page (</w:t>
+      </w:r>
+      <w:proofErr w:type="spellStart"/>
+      <w:r>
+        <w:t>Youtube</w:t>
+      </w:r>
+      <w:proofErr w:type="spellEnd"/>
+      <w:r>
+        <w:t xml:space="preserve"> + Spotify</w:t>
       </w:r>
       <w:r>
         <w:t xml:space="preserve"> + apple music</w:t>
@@ -153,7 +367,7 @@
       <w:pPr>
         <w:pStyle w:val="ListParagraph"/>
       </w:pPr>
-      <w:hyperlink r:id="rId9" w:history="1">
+      <w:hyperlink r:id="rId12" w:history="1">
         <w:r>
           <w:rPr>
             <w:rStyle w:val="Hyperlink"/>
@@ -166,7 +380,7 @@
       <w:pPr>
         <w:pStyle w:val="ListParagraph"/>
       </w:pPr>
-      <w:hyperlink r:id="rId10" w:history="1">
+      <w:hyperlink r:id="rId13" w:history="1">
         <w:r>
           <w:rPr>
             <w:rStyle w:val="Hyperlink"/>
@@ -232,19 +446,12 @@
           <w:rStyle w:val="Hyperlink"/>
         </w:rPr>
       </w:pPr>
-      <w:hyperlink r:id="rId11" w:history="1">
+      <w:hyperlink r:id="rId14" w:history="1">
         <w:r>
           <w:rPr>
             <w:rStyle w:val="Hyperlink"/>
           </w:rPr>
-          <w:t>https://aws.amazon.com/amplify/?sc_icampaign=Adoption_Campaign_w5y21_consolesignin_slot5_amplify&amp;sc_ichannel=ha&amp;sc_icontent=awssm-6741_pac&amp;sc_ioutcome=PaaS_Digital_Marketing&amp;sc_iplace=signin&amp;trk=ha_a134p000006gd9cAAA~ha_awssm-</w:t>
-        </w:r>
-        <w:r>
-          <w:rPr>
-            <w:rStyle w:val="Hyperlink"/>
-          </w:rPr>
-          <w:lastRenderedPageBreak/>
-          <w:t>6741_pac&amp;trkCampaign=w5y21_consolesignin_slot5_amplify&amp;fbclid=IwAR3pXeLP_0fqrmwBPIzMi0YQhPqeygjbT1N0AY6aV64ihCACVUUcQ5zM76E</w:t>
+          <w:t>https://aws.amazon.com/amplify/?sc_icampaign=Adoption_Campaign_w5y21_consolesignin_slot5_amplify&amp;sc_ichannel=ha&amp;sc_icontent=awssm-6741_pac&amp;sc_ioutcome=PaaS_Digital_Marketing&amp;sc_iplace=signin&amp;trk=ha_a134p000006gd9cAAA~ha_awssm-6741_pac&amp;trkCampaign=w5y21_consolesignin_slot5_amplify&amp;fbclid=IwAR3pXeLP_0fqrmwBPIzMi0YQhPqeygjbT1N0AY6aV64ihCACVUUcQ5zM76E</w:t>
         </w:r>
       </w:hyperlink>
     </w:p>
@@ -255,7 +462,7 @@
         </w:rPr>
         <w:br/>
       </w:r>
-      <w:hyperlink r:id="rId12" w:history="1">
+      <w:hyperlink r:id="rId15" w:history="1">
         <w:r>
           <w:rPr>
             <w:rStyle w:val="Hyperlink"/>
@@ -865,6 +1072,17 @@
       <w:shd w:val="clear" w:color="auto" w:fill="E1DFDD"/>
     </w:rPr>
   </w:style>
+  <w:style w:type="character" w:styleId="Strong">
+    <w:name w:val="Strong"/>
+    <w:basedOn w:val="DefaultParagraphFont"/>
+    <w:uiPriority w:val="22"/>
+    <w:qFormat/>
+    <w:rsid w:val="00C24BB1"/>
+    <w:rPr>
+      <w:b/>
+      <w:bCs/>
+    </w:rPr>
+  </w:style>
 </w:styles>
 </file>
 

</xml_diff>

<commit_message>
update: how to install usb debugging working
</commit_message>
<xml_diff>
--- a/Basic app on android.docx
+++ b/Basic app on android.docx
@@ -296,6 +296,309 @@
     <w:p>
       <w:pPr>
         <w:ind w:left="360"/>
+        <w:rPr>
+          <w:rStyle w:val="Strong"/>
+          <w:rFonts w:ascii="Arial" w:hAnsi="Arial" w:cs="Arial"/>
+          <w:color w:val="242729"/>
+          <w:sz w:val="23"/>
+          <w:szCs w:val="23"/>
+          <w:bdr w:val="none" w:sz="0" w:space="0" w:color="auto" w:frame="1"/>
+          <w:shd w:val="clear" w:color="auto" w:fill="FFFFFF"/>
+        </w:rPr>
+      </w:pPr>
+      <w:r>
+        <w:rPr>
+          <w:rStyle w:val="Strong"/>
+          <w:rFonts w:ascii="Arial" w:hAnsi="Arial" w:cs="Arial"/>
+          <w:color w:val="242729"/>
+          <w:sz w:val="23"/>
+          <w:szCs w:val="23"/>
+          <w:bdr w:val="none" w:sz="0" w:space="0" w:color="auto" w:frame="1"/>
+          <w:shd w:val="clear" w:color="auto" w:fill="FFFFFF"/>
+        </w:rPr>
+        <w:t>update:</w:t>
+      </w:r>
+    </w:p>
+    <w:p>
+      <w:pPr>
+        <w:ind w:left="360"/>
+        <w:rPr>
+          <w:rStyle w:val="Strong"/>
+          <w:rFonts w:ascii="Arial" w:hAnsi="Arial" w:cs="Arial"/>
+          <w:color w:val="242729"/>
+          <w:sz w:val="23"/>
+          <w:szCs w:val="23"/>
+          <w:bdr w:val="none" w:sz="0" w:space="0" w:color="auto" w:frame="1"/>
+          <w:shd w:val="clear" w:color="auto" w:fill="FFFFFF"/>
+        </w:rPr>
+      </w:pPr>
+      <w:r>
+        <w:rPr>
+          <w:rStyle w:val="Strong"/>
+          <w:rFonts w:ascii="Arial" w:hAnsi="Arial" w:cs="Arial"/>
+          <w:color w:val="242729"/>
+          <w:sz w:val="23"/>
+          <w:szCs w:val="23"/>
+          <w:bdr w:val="none" w:sz="0" w:space="0" w:color="auto" w:frame="1"/>
+          <w:shd w:val="clear" w:color="auto" w:fill="FFFFFF"/>
+        </w:rPr>
+        <w:lastRenderedPageBreak/>
+        <w:t xml:space="preserve">after playing with </w:t>
+      </w:r>
+      <w:proofErr w:type="spellStart"/>
+      <w:r>
+        <w:rPr>
+          <w:rStyle w:val="Strong"/>
+          <w:rFonts w:ascii="Arial" w:hAnsi="Arial" w:cs="Arial"/>
+          <w:color w:val="242729"/>
+          <w:sz w:val="23"/>
+          <w:szCs w:val="23"/>
+          <w:bdr w:val="none" w:sz="0" w:space="0" w:color="auto" w:frame="1"/>
+          <w:shd w:val="clear" w:color="auto" w:fill="FFFFFF"/>
+        </w:rPr>
+        <w:t>usb</w:t>
+      </w:r>
+      <w:proofErr w:type="spellEnd"/>
+      <w:r>
+        <w:rPr>
+          <w:rStyle w:val="Strong"/>
+          <w:rFonts w:ascii="Arial" w:hAnsi="Arial" w:cs="Arial"/>
+          <w:color w:val="242729"/>
+          <w:sz w:val="23"/>
+          <w:szCs w:val="23"/>
+          <w:bdr w:val="none" w:sz="0" w:space="0" w:color="auto" w:frame="1"/>
+          <w:shd w:val="clear" w:color="auto" w:fill="FFFFFF"/>
+        </w:rPr>
+        <w:t xml:space="preserve"> debugging on my phone back and forth I realized I can simply go to the folder where “android </w:t>
+      </w:r>
+      <w:proofErr w:type="spellStart"/>
+      <w:r>
+        <w:rPr>
+          <w:rStyle w:val="Strong"/>
+          <w:rFonts w:ascii="Arial" w:hAnsi="Arial" w:cs="Arial"/>
+          <w:color w:val="242729"/>
+          <w:sz w:val="23"/>
+          <w:szCs w:val="23"/>
+          <w:bdr w:val="none" w:sz="0" w:space="0" w:color="auto" w:frame="1"/>
+          <w:shd w:val="clear" w:color="auto" w:fill="FFFFFF"/>
+        </w:rPr>
+        <w:t>usb</w:t>
+      </w:r>
+      <w:proofErr w:type="spellEnd"/>
+      <w:r>
+        <w:rPr>
+          <w:rStyle w:val="Strong"/>
+          <w:rFonts w:ascii="Arial" w:hAnsi="Arial" w:cs="Arial"/>
+          <w:color w:val="242729"/>
+          <w:sz w:val="23"/>
+          <w:szCs w:val="23"/>
+          <w:bdr w:val="none" w:sz="0" w:space="0" w:color="auto" w:frame="1"/>
+          <w:shd w:val="clear" w:color="auto" w:fill="FFFFFF"/>
+        </w:rPr>
+        <w:t xml:space="preserve"> driver was’’ installed and right click and install it on my computer ( not as cd rom or whatever </w:t>
+      </w:r>
+      <w:proofErr w:type="spellStart"/>
+      <w:r>
+        <w:rPr>
+          <w:rStyle w:val="Strong"/>
+          <w:rFonts w:ascii="Arial" w:hAnsi="Arial" w:cs="Arial"/>
+          <w:color w:val="242729"/>
+          <w:sz w:val="23"/>
+          <w:szCs w:val="23"/>
+          <w:bdr w:val="none" w:sz="0" w:space="0" w:color="auto" w:frame="1"/>
+          <w:shd w:val="clear" w:color="auto" w:fill="FFFFFF"/>
+        </w:rPr>
+        <w:t>they re</w:t>
+      </w:r>
+      <w:proofErr w:type="spellEnd"/>
+      <w:r>
+        <w:rPr>
+          <w:rStyle w:val="Strong"/>
+          <w:rFonts w:ascii="Arial" w:hAnsi="Arial" w:cs="Arial"/>
+          <w:color w:val="242729"/>
+          <w:sz w:val="23"/>
+          <w:szCs w:val="23"/>
+          <w:bdr w:val="none" w:sz="0" w:space="0" w:color="auto" w:frame="1"/>
+          <w:shd w:val="clear" w:color="auto" w:fill="FFFFFF"/>
+        </w:rPr>
+        <w:t xml:space="preserve"> </w:t>
+      </w:r>
+      <w:proofErr w:type="spellStart"/>
+      <w:r>
+        <w:rPr>
+          <w:rStyle w:val="Strong"/>
+          <w:rFonts w:ascii="Arial" w:hAnsi="Arial" w:cs="Arial"/>
+          <w:color w:val="242729"/>
+          <w:sz w:val="23"/>
+          <w:szCs w:val="23"/>
+          <w:bdr w:val="none" w:sz="0" w:space="0" w:color="auto" w:frame="1"/>
+          <w:shd w:val="clear" w:color="auto" w:fill="FFFFFF"/>
+        </w:rPr>
+        <w:t>seing</w:t>
+      </w:r>
+      <w:proofErr w:type="spellEnd"/>
+      <w:r>
+        <w:rPr>
+          <w:rStyle w:val="Strong"/>
+          <w:rFonts w:ascii="Arial" w:hAnsi="Arial" w:cs="Arial"/>
+          <w:color w:val="242729"/>
+          <w:sz w:val="23"/>
+          <w:szCs w:val="23"/>
+          <w:bdr w:val="none" w:sz="0" w:space="0" w:color="auto" w:frame="1"/>
+          <w:shd w:val="clear" w:color="auto" w:fill="FFFFFF"/>
+        </w:rPr>
+        <w:t xml:space="preserve"> there)</w:t>
+      </w:r>
+    </w:p>
+    <w:p>
+      <w:pPr>
+        <w:ind w:left="360"/>
+        <w:rPr>
+          <w:rStyle w:val="Strong"/>
+          <w:rFonts w:ascii="Arial" w:hAnsi="Arial" w:cs="Arial"/>
+          <w:color w:val="242729"/>
+          <w:sz w:val="23"/>
+          <w:szCs w:val="23"/>
+          <w:bdr w:val="none" w:sz="0" w:space="0" w:color="auto" w:frame="1"/>
+          <w:shd w:val="clear" w:color="auto" w:fill="FFFFFF"/>
+        </w:rPr>
+      </w:pPr>
+      <w:r>
+        <w:rPr>
+          <w:rStyle w:val="Strong"/>
+          <w:rFonts w:ascii="Arial" w:hAnsi="Arial" w:cs="Arial"/>
+          <w:color w:val="242729"/>
+          <w:sz w:val="23"/>
+          <w:szCs w:val="23"/>
+          <w:bdr w:val="none" w:sz="0" w:space="0" w:color="auto" w:frame="1"/>
+          <w:shd w:val="clear" w:color="auto" w:fill="FFFFFF"/>
+        </w:rPr>
+        <w:t xml:space="preserve">and enable </w:t>
+      </w:r>
+      <w:proofErr w:type="spellStart"/>
+      <w:r>
+        <w:rPr>
+          <w:rStyle w:val="Strong"/>
+          <w:rFonts w:ascii="Arial" w:hAnsi="Arial" w:cs="Arial"/>
+          <w:color w:val="242729"/>
+          <w:sz w:val="23"/>
+          <w:szCs w:val="23"/>
+          <w:bdr w:val="none" w:sz="0" w:space="0" w:color="auto" w:frame="1"/>
+          <w:shd w:val="clear" w:color="auto" w:fill="FFFFFF"/>
+        </w:rPr>
+        <w:t>usb</w:t>
+      </w:r>
+      <w:proofErr w:type="spellEnd"/>
+      <w:r>
+        <w:rPr>
+          <w:rStyle w:val="Strong"/>
+          <w:rFonts w:ascii="Arial" w:hAnsi="Arial" w:cs="Arial"/>
+          <w:color w:val="242729"/>
+          <w:sz w:val="23"/>
+          <w:szCs w:val="23"/>
+          <w:bdr w:val="none" w:sz="0" w:space="0" w:color="auto" w:frame="1"/>
+          <w:shd w:val="clear" w:color="auto" w:fill="FFFFFF"/>
+        </w:rPr>
+        <w:t xml:space="preserve"> debugging on my phone I could see my device with </w:t>
+      </w:r>
+      <w:proofErr w:type="spellStart"/>
+      <w:r>
+        <w:rPr>
+          <w:rStyle w:val="Strong"/>
+          <w:rFonts w:ascii="Arial" w:hAnsi="Arial" w:cs="Arial"/>
+          <w:color w:val="242729"/>
+          <w:sz w:val="23"/>
+          <w:szCs w:val="23"/>
+          <w:bdr w:val="none" w:sz="0" w:space="0" w:color="auto" w:frame="1"/>
+          <w:shd w:val="clear" w:color="auto" w:fill="FFFFFF"/>
+        </w:rPr>
+        <w:t>adb</w:t>
+      </w:r>
+      <w:proofErr w:type="spellEnd"/>
+      <w:r>
+        <w:rPr>
+          <w:rStyle w:val="Strong"/>
+          <w:rFonts w:ascii="Arial" w:hAnsi="Arial" w:cs="Arial"/>
+          <w:color w:val="242729"/>
+          <w:sz w:val="23"/>
+          <w:szCs w:val="23"/>
+          <w:bdr w:val="none" w:sz="0" w:space="0" w:color="auto" w:frame="1"/>
+          <w:shd w:val="clear" w:color="auto" w:fill="FFFFFF"/>
+        </w:rPr>
+        <w:t xml:space="preserve"> devices and flutter devices commands</w:t>
+      </w:r>
+    </w:p>
+    <w:p>
+      <w:pPr>
+        <w:ind w:left="360"/>
+        <w:rPr>
+          <w:rStyle w:val="Strong"/>
+          <w:rFonts w:ascii="Arial" w:hAnsi="Arial" w:cs="Arial"/>
+          <w:color w:val="242729"/>
+          <w:sz w:val="23"/>
+          <w:szCs w:val="23"/>
+          <w:bdr w:val="none" w:sz="0" w:space="0" w:color="auto" w:frame="1"/>
+          <w:shd w:val="clear" w:color="auto" w:fill="FFFFFF"/>
+        </w:rPr>
+      </w:pPr>
+    </w:p>
+    <w:p>
+      <w:pPr>
+        <w:ind w:left="360"/>
+        <w:rPr>
+          <w:rStyle w:val="Strong"/>
+          <w:rFonts w:ascii="Arial" w:hAnsi="Arial" w:cs="Arial"/>
+          <w:color w:val="242729"/>
+          <w:sz w:val="23"/>
+          <w:szCs w:val="23"/>
+          <w:bdr w:val="none" w:sz="0" w:space="0" w:color="auto" w:frame="1"/>
+          <w:shd w:val="clear" w:color="auto" w:fill="FFFFFF"/>
+        </w:rPr>
+      </w:pPr>
+      <w:r>
+        <w:rPr>
+          <w:noProof/>
+        </w:rPr>
+        <w:drawing>
+          <wp:inline distT="0" distB="0" distL="0" distR="0" wp14:anchorId="357EAB20" wp14:editId="4107D530">
+            <wp:extent cx="5943600" cy="1766570"/>
+            <wp:effectExtent l="0" t="0" r="0" b="5080"/>
+            <wp:docPr id="2" name="Picture 2"/>
+            <wp:cNvGraphicFramePr>
+              <a:graphicFrameLocks xmlns:a="http://schemas.openxmlformats.org/drawingml/2006/main" noChangeAspect="1"/>
+            </wp:cNvGraphicFramePr>
+            <a:graphic xmlns:a="http://schemas.openxmlformats.org/drawingml/2006/main">
+              <a:graphicData uri="http://schemas.openxmlformats.org/drawingml/2006/picture">
+                <pic:pic xmlns:pic="http://schemas.openxmlformats.org/drawingml/2006/picture">
+                  <pic:nvPicPr>
+                    <pic:cNvPr id="1" name=""/>
+                    <pic:cNvPicPr/>
+                  </pic:nvPicPr>
+                  <pic:blipFill>
+                    <a:blip r:embed="rId10"/>
+                    <a:stretch>
+                      <a:fillRect/>
+                    </a:stretch>
+                  </pic:blipFill>
+                  <pic:spPr>
+                    <a:xfrm>
+                      <a:off x="0" y="0"/>
+                      <a:ext cx="5943600" cy="1766570"/>
+                    </a:xfrm>
+                    <a:prstGeom prst="rect">
+                      <a:avLst/>
+                    </a:prstGeom>
+                  </pic:spPr>
+                </pic:pic>
+              </a:graphicData>
+            </a:graphic>
+          </wp:inline>
+        </w:drawing>
+      </w:r>
+    </w:p>
+    <w:p>
+      <w:pPr>
+        <w:ind w:left="360"/>
       </w:pPr>
       <w:r>
         <w:t>about android:</w:t>
@@ -305,19 +608,6 @@
       <w:pPr>
         <w:ind w:left="360"/>
       </w:pPr>
-    </w:p>
-    <w:p>
-      <w:pPr>
-        <w:ind w:left="360"/>
-      </w:pPr>
-      <w:hyperlink r:id="rId10" w:history="1">
-        <w:r>
-          <w:rPr>
-            <w:rStyle w:val="Hyperlink"/>
-          </w:rPr>
-          <w:t>https://developer.android.com/training/basics/firstapp/creating-project</w:t>
-        </w:r>
-      </w:hyperlink>
     </w:p>
     <w:p>
       <w:pPr>
@@ -336,6 +626,19 @@
       <w:pPr>
         <w:ind w:left="360"/>
       </w:pPr>
+      <w:hyperlink r:id="rId12" w:history="1">
+        <w:r>
+          <w:rPr>
+            <w:rStyle w:val="Hyperlink"/>
+          </w:rPr>
+          <w:t>https://developer.android.com/training/basics/firstapp/creating-project</w:t>
+        </w:r>
+      </w:hyperlink>
+    </w:p>
+    <w:p>
+      <w:pPr>
+        <w:ind w:left="360"/>
+      </w:pPr>
     </w:p>
     <w:p>
       <w:pPr>
@@ -367,7 +670,7 @@
       <w:pPr>
         <w:pStyle w:val="ListParagraph"/>
       </w:pPr>
-      <w:hyperlink r:id="rId12" w:history="1">
+      <w:hyperlink r:id="rId13" w:history="1">
         <w:r>
           <w:rPr>
             <w:rStyle w:val="Hyperlink"/>
@@ -380,7 +683,7 @@
       <w:pPr>
         <w:pStyle w:val="ListParagraph"/>
       </w:pPr>
-      <w:hyperlink r:id="rId13" w:history="1">
+      <w:hyperlink r:id="rId14" w:history="1">
         <w:r>
           <w:rPr>
             <w:rStyle w:val="Hyperlink"/>
@@ -446,7 +749,7 @@
           <w:rStyle w:val="Hyperlink"/>
         </w:rPr>
       </w:pPr>
-      <w:hyperlink r:id="rId14" w:history="1">
+      <w:hyperlink r:id="rId15" w:history="1">
         <w:r>
           <w:rPr>
             <w:rStyle w:val="Hyperlink"/>
@@ -462,7 +765,7 @@
         </w:rPr>
         <w:br/>
       </w:r>
-      <w:hyperlink r:id="rId15" w:history="1">
+      <w:hyperlink r:id="rId16" w:history="1">
         <w:r>
           <w:rPr>
             <w:rStyle w:val="Hyperlink"/>

</xml_diff>